<commit_message>
Feature: tests e2e de seguridad XSS (muro y comentarios) e informe de pruebas v1.2 (32 casos)
</commit_message>
<xml_diff>
--- a/Informe_de_Pruebas_Requintu.docx
+++ b/Informe_de_Pruebas_Requintu.docx
@@ -39,7 +39,7 @@
       </w:pPr>
       <w:r>
         <w:rPr/>
-        <w:t xml:space="preserve">     30 pruebas ejecutadas — 30 aprobadas (100%)</w:t>
+        <w:t xml:space="preserve">     32 pruebas ejecutadas — 32 aprobadas (100%)</w:t>
       </w:r>
     </w:p>
     <w:p>
@@ -73,33 +73,33 @@
       </w:pPr>
       <w:r>
         <w:rPr/>
-        <w:t xml:space="preserve">     Frontend E2E: Playwright + Chromium — 9 pruebas</w:t>
-      </w:r>
-    </w:p>
-    <w:p>
-      <w:pPr>
-        <w:spacing w:lineRule="auto"/>
-      </w:pPr>
-      <w:r>
-        <w:rPr/>
-      </w:r>
-    </w:p>
-    <w:p>
-      <w:pPr>
-        <w:spacing w:lineRule="auto"/>
-      </w:pPr>
-      <w:r>
-        <w:rPr/>
-        <w:t xml:space="preserve">     Fecha: 28 de agosto de 2026   </w:t>
-      </w:r>
-    </w:p>
-    <w:p>
-      <w:pPr>
-        <w:spacing w:lineRule="auto"/>
-      </w:pPr>
-      <w:r>
-        <w:rPr/>
-        <w:t xml:space="preserve">Versión 1.1</w:t>
+        <w:t xml:space="preserve">     Frontend E2E: Playwright + Chromium — 11 pruebas</w:t>
+      </w:r>
+    </w:p>
+    <w:p>
+      <w:pPr>
+        <w:spacing w:lineRule="auto"/>
+      </w:pPr>
+      <w:r>
+        <w:rPr/>
+      </w:r>
+    </w:p>
+    <w:p>
+      <w:pPr>
+        <w:spacing w:lineRule="auto"/>
+      </w:pPr>
+      <w:r>
+        <w:rPr/>
+        <w:t xml:space="preserve">     Fecha: 30 de agosto de 2026   </w:t>
+      </w:r>
+    </w:p>
+    <w:p>
+      <w:pPr>
+        <w:spacing w:lineRule="auto"/>
+      </w:pPr>
+      <w:r>
+        <w:rPr/>
+        <w:t xml:space="preserve">Versión 1.2</w:t>
       </w:r>
     </w:p>
     <w:p>
@@ -155,7 +155,7 @@
       </w:pPr>
       <w:r>
         <w:rPr/>
-        <w:t xml:space="preserve">9</w:t>
+        <w:t xml:space="preserve">11</w:t>
       </w:r>
     </w:p>
     <w:p>
@@ -173,7 +173,7 @@
       </w:pPr>
       <w:r>
         <w:rPr/>
-        <w:t xml:space="preserve">30</w:t>
+        <w:t xml:space="preserve">32</w:t>
       </w:r>
     </w:p>
     <w:p>
@@ -1046,7 +1046,7 @@
       </w:pPr>
       <w:r>
         <w:rPr/>
-        <w:t xml:space="preserve">3.2 Frontend e2e (9 pruebas)</w:t>
+        <w:t xml:space="preserve">3.2 Frontend e2e (11 pruebas)</w:t>
       </w:r>
     </w:p>
     <w:p>
@@ -1066,7 +1066,7 @@
         <w:rPr>
           <w:rFonts w:ascii="Courier" w:hAnsi="Courier"/>
         </w:rPr>
-        <w:t xml:space="preserve"> cd frontend npx playwright install chromium   # solo la primera vez npm run test:e2e                  # o: npx playwright test # Resultado: 9 passed, 0 failed   (~9-25 s) </w:t>
+        <w:t xml:space="preserve"> cd frontend npx playwright install chromium   # solo la primera vez npm run test:e2e                  # o: npx playwright test # Resultado: 11 passed, 0 failed   (~10-25 s) </w:t>
       </w:r>
     </w:p>
     <w:p>
@@ -3780,6 +3780,168 @@
           </w:p>
         </w:tc>
       </w:tr>
+      <w:tr>
+        <w:trPr>
+          <w:cantSplit/>
+        </w:trPr>
+        <w:tc>
+          <w:tcPr>
+            <w:tcBorders>
+              <w:top w:val="single" w:sz="1" w:space="0" w:color="000000"/>
+              <w:bottom w:val="single" w:sz="1" w:space="0" w:color="000000"/>
+              <w:left w:val="single" w:sz="1" w:space="0" w:color="000000"/>
+              <w:right w:val="single" w:sz="1" w:space="0" w:color="000000"/>
+            </w:tcBorders>
+          </w:tcPr>
+          <w:p>
+            <w:pPr>
+              <w:spacing w:lineRule="auto"/>
+            </w:pPr>
+            <w:r>
+              <w:rPr/>
+              <w:t xml:space="preserve">10</w:t>
+            </w:r>
+          </w:p>
+        </w:tc>
+        <w:tc>
+          <w:tcPr>
+            <w:tcBorders>
+              <w:top w:val="single" w:sz="1" w:space="0" w:color="000000"/>
+              <w:bottom w:val="single" w:sz="1" w:space="0" w:color="000000"/>
+              <w:left w:val="single" w:sz="1" w:space="0" w:color="000000"/>
+              <w:right w:val="single" w:sz="1" w:space="0" w:color="000000"/>
+            </w:tcBorders>
+          </w:tcPr>
+          <w:p>
+            <w:pPr>
+              <w:spacing w:lineRule="auto"/>
+            </w:pPr>
+            <w:r>
+              <w:rPr/>
+              <w:t xml:space="preserve">Publicaciones con payload XSS se muestran como texto inerte</w:t>
+            </w:r>
+          </w:p>
+        </w:tc>
+        <w:tc>
+          <w:tcPr>
+            <w:tcBorders>
+              <w:top w:val="single" w:sz="1" w:space="0" w:color="000000"/>
+              <w:bottom w:val="single" w:sz="1" w:space="0" w:color="000000"/>
+              <w:left w:val="single" w:sz="1" w:space="0" w:color="000000"/>
+              <w:right w:val="single" w:sz="1" w:space="0" w:color="000000"/>
+            </w:tcBorders>
+          </w:tcPr>
+          <w:p>
+            <w:pPr>
+              <w:spacing w:lineRule="auto"/>
+            </w:pPr>
+            <w:r>
+              <w:rPr/>
+              <w:t xml:space="preserve">Un &lt;script&gt; y un &lt;img onerror&gt; dentro de una publicación no se ejecutan: React los escapa y aparecen como texto plano.</w:t>
+            </w:r>
+          </w:p>
+        </w:tc>
+        <w:tc>
+          <w:tcPr>
+            <w:tcBorders>
+              <w:top w:val="single" w:sz="1" w:space="0" w:color="000000"/>
+              <w:bottom w:val="single" w:sz="1" w:space="0" w:color="000000"/>
+              <w:left w:val="single" w:sz="1" w:space="0" w:color="000000"/>
+              <w:right w:val="single" w:sz="1" w:space="0" w:color="000000"/>
+            </w:tcBorders>
+          </w:tcPr>
+          <w:p>
+            <w:pPr>
+              <w:spacing w:lineRule="auto"/>
+            </w:pPr>
+            <w:r>
+              <w:rPr/>
+              <w:t xml:space="preserve">Aprobada</w:t>
+            </w:r>
+          </w:p>
+        </w:tc>
+      </w:tr>
+      <w:tr>
+        <w:trPr>
+          <w:cantSplit/>
+        </w:trPr>
+        <w:tc>
+          <w:tcPr>
+            <w:tcBorders>
+              <w:top w:val="single" w:sz="1" w:space="0" w:color="000000"/>
+              <w:bottom w:val="single" w:sz="1" w:space="0" w:color="000000"/>
+              <w:left w:val="single" w:sz="1" w:space="0" w:color="000000"/>
+              <w:right w:val="single" w:sz="1" w:space="0" w:color="000000"/>
+            </w:tcBorders>
+          </w:tcPr>
+          <w:p>
+            <w:pPr>
+              <w:spacing w:lineRule="auto"/>
+            </w:pPr>
+            <w:r>
+              <w:rPr/>
+              <w:t xml:space="preserve">11</w:t>
+            </w:r>
+          </w:p>
+        </w:tc>
+        <w:tc>
+          <w:tcPr>
+            <w:tcBorders>
+              <w:top w:val="single" w:sz="1" w:space="0" w:color="000000"/>
+              <w:bottom w:val="single" w:sz="1" w:space="0" w:color="000000"/>
+              <w:left w:val="single" w:sz="1" w:space="0" w:color="000000"/>
+              <w:right w:val="single" w:sz="1" w:space="0" w:color="000000"/>
+            </w:tcBorders>
+          </w:tcPr>
+          <w:p>
+            <w:pPr>
+              <w:spacing w:lineRule="auto"/>
+            </w:pPr>
+            <w:r>
+              <w:rPr/>
+              <w:t xml:space="preserve">Comentarios con payload XSS se muestran como texto inerte</w:t>
+            </w:r>
+          </w:p>
+        </w:tc>
+        <w:tc>
+          <w:tcPr>
+            <w:tcBorders>
+              <w:top w:val="single" w:sz="1" w:space="0" w:color="000000"/>
+              <w:bottom w:val="single" w:sz="1" w:space="0" w:color="000000"/>
+              <w:left w:val="single" w:sz="1" w:space="0" w:color="000000"/>
+              <w:right w:val="single" w:sz="1" w:space="0" w:color="000000"/>
+            </w:tcBorders>
+          </w:tcPr>
+          <w:p>
+            <w:pPr>
+              <w:spacing w:lineRule="auto"/>
+            </w:pPr>
+            <w:r>
+              <w:rPr/>
+              <w:t xml:space="preserve">Un &lt;svg onload&gt; y un &lt;img onerror&gt; dentro de una calificación no se ejecutan en el detalle del local.</w:t>
+            </w:r>
+          </w:p>
+        </w:tc>
+        <w:tc>
+          <w:tcPr>
+            <w:tcBorders>
+              <w:top w:val="single" w:sz="1" w:space="0" w:color="000000"/>
+              <w:bottom w:val="single" w:sz="1" w:space="0" w:color="000000"/>
+              <w:left w:val="single" w:sz="1" w:space="0" w:color="000000"/>
+              <w:right w:val="single" w:sz="1" w:space="0" w:color="000000"/>
+            </w:tcBorders>
+          </w:tcPr>
+          <w:p>
+            <w:pPr>
+              <w:spacing w:lineRule="auto"/>
+            </w:pPr>
+            <w:r>
+              <w:rPr/>
+              <w:t xml:space="preserve">Aprobada</w:t>
+            </w:r>
+          </w:p>
+        </w:tc>
+      </w:tr>
     </w:tbl>
     <w:p>
       <w:pPr>
@@ -3787,6 +3949,29 @@
       </w:pPr>
       <w:r>
         <w:rPr/>
+      </w:r>
+    </w:p>
+    <w:p>
+      <w:pPr>
+        <w:spacing w:lineRule="auto"/>
+      </w:pPr>
+      <w:r>
+        <w:rPr>
+          <w:b/>
+        </w:rPr>
+        <w:t xml:space="preserve">Nuevo en esta versión:</w:t>
+      </w:r>
+      <w:r>
+        <w:rPr/>
+        <w:t xml:space="preserve"> se añadieron 2 casos e2e de seguridad XSS. Un usuario publica en el muro y comenta un local con payloads clásicos (&lt;script&gt;, &lt;img onerror&gt;, &lt;svg onload&gt;); la interfaz los muestra como texto plano inerte: no se crea ningún elemento vivo (0 scripts/etiquetas ejecutables) y las variables </w:t>
+      </w:r>
+      <w:r>
+        <w:rPr/>
+        <w:t xml:space="preserve">window</w:t>
+      </w:r>
+      <w:r>
+        <w:rPr/>
+        <w:t xml:space="preserve"> que el payload intenta fijar permanecen indefinidas.</w:t>
       </w:r>
     </w:p>
     <w:p>
@@ -3853,7 +4038,7 @@
       </w:r>
       <w:r>
         <w:rPr/>
-        <w:t xml:space="preserve"> CORS, 401/403 sin token, tokens falsificados, anti-fuerza bruta (respuestas idénticas), rotación y revocación de sesiones, filtro de roles.</w:t>
+        <w:t xml:space="preserve"> CORS, 401/403 sin token, tokens falsificados, anti-fuerza bruta (respuestas idénticas), rotación y revocación de sesiones, filtro de roles, e inyección XSS (&lt;script&gt;, &lt;img onerror&gt;, &lt;svg onload&gt;) que se renderiza como texto inerte.</w:t>
       </w:r>
     </w:p>
     <w:p>
@@ -3947,7 +4132,7 @@
       </w:pPr>
       <w:r>
         <w:rPr/>
-        <w:t xml:space="preserve">9/9</w:t>
+        <w:t xml:space="preserve">11/11</w:t>
       </w:r>
     </w:p>
     <w:p>
@@ -3983,7 +4168,7 @@
       </w:pPr>
       <w:r>
         <w:rPr/>
-        <w:t xml:space="preserve">Todas las pruebas fueron ejecutadas el 28 de agosto de 2026 y quedaron versionadas en el repositorio (rama </w:t>
+        <w:t xml:space="preserve">Todas las pruebas fueron ejecutadas el 30 de agosto de 2026 y quedaron versionadas en el repositorio (rama </w:t>
       </w:r>
       <w:r>
         <w:rPr/>

</xml_diff>

<commit_message>
Feature: moderación de imágenes NSFW (nsfwjs local) y sistema de denuncias con panel admin; informe de pruebas v1.3 (34 casos)
</commit_message>
<xml_diff>
--- a/Informe_de_Pruebas_Requintu.docx
+++ b/Informe_de_Pruebas_Requintu.docx
@@ -39,67 +39,67 @@
       </w:pPr>
       <w:r>
         <w:rPr/>
-        <w:t xml:space="preserve">     32 pruebas ejecutadas — 32 aprobadas (100%)</w:t>
-      </w:r>
-    </w:p>
-    <w:p>
-      <w:pPr>
-        <w:spacing w:lineRule="auto"/>
-      </w:pPr>
-      <w:r>
-        <w:rPr/>
-      </w:r>
-    </w:p>
-    <w:p>
-      <w:pPr>
-        <w:spacing w:lineRule="auto"/>
-      </w:pPr>
-      <w:r>
-        <w:rPr/>
-        <w:t xml:space="preserve">     Backend: Node.js (node:test) — 21 pruebas</w:t>
-      </w:r>
-    </w:p>
-    <w:p>
-      <w:pPr>
-        <w:spacing w:lineRule="auto"/>
-      </w:pPr>
-      <w:r>
-        <w:rPr/>
-      </w:r>
-    </w:p>
-    <w:p>
-      <w:pPr>
-        <w:spacing w:lineRule="auto"/>
-      </w:pPr>
-      <w:r>
-        <w:rPr/>
-        <w:t xml:space="preserve">     Frontend E2E: Playwright + Chromium — 11 pruebas</w:t>
-      </w:r>
-    </w:p>
-    <w:p>
-      <w:pPr>
-        <w:spacing w:lineRule="auto"/>
-      </w:pPr>
-      <w:r>
-        <w:rPr/>
-      </w:r>
-    </w:p>
-    <w:p>
-      <w:pPr>
-        <w:spacing w:lineRule="auto"/>
-      </w:pPr>
-      <w:r>
-        <w:rPr/>
-        <w:t xml:space="preserve">     Fecha: 30 de agosto de 2026   </w:t>
-      </w:r>
-    </w:p>
-    <w:p>
-      <w:pPr>
-        <w:spacing w:lineRule="auto"/>
-      </w:pPr>
-      <w:r>
-        <w:rPr/>
-        <w:t xml:space="preserve">Versión 1.2</w:t>
+        <w:t xml:space="preserve">     34 pruebas ejecutadas — 34 aprobadas (100%)</w:t>
+      </w:r>
+    </w:p>
+    <w:p>
+      <w:pPr>
+        <w:spacing w:lineRule="auto"/>
+      </w:pPr>
+      <w:r>
+        <w:rPr/>
+      </w:r>
+    </w:p>
+    <w:p>
+      <w:pPr>
+        <w:spacing w:lineRule="auto"/>
+      </w:pPr>
+      <w:r>
+        <w:rPr/>
+        <w:t xml:space="preserve">     Backend: Node.js (node:test) — 22 pruebas</w:t>
+      </w:r>
+    </w:p>
+    <w:p>
+      <w:pPr>
+        <w:spacing w:lineRule="auto"/>
+      </w:pPr>
+      <w:r>
+        <w:rPr/>
+      </w:r>
+    </w:p>
+    <w:p>
+      <w:pPr>
+        <w:spacing w:lineRule="auto"/>
+      </w:pPr>
+      <w:r>
+        <w:rPr/>
+        <w:t xml:space="preserve">     Frontend E2E: Playwright + Chromium — 12 pruebas</w:t>
+      </w:r>
+    </w:p>
+    <w:p>
+      <w:pPr>
+        <w:spacing w:lineRule="auto"/>
+      </w:pPr>
+      <w:r>
+        <w:rPr/>
+      </w:r>
+    </w:p>
+    <w:p>
+      <w:pPr>
+        <w:spacing w:lineRule="auto"/>
+      </w:pPr>
+      <w:r>
+        <w:rPr/>
+        <w:t xml:space="preserve">     Fecha: 4 de septiembre de 2026   </w:t>
+      </w:r>
+    </w:p>
+    <w:p>
+      <w:pPr>
+        <w:spacing w:lineRule="auto"/>
+      </w:pPr>
+      <w:r>
+        <w:rPr/>
+        <w:t xml:space="preserve">Versión 1.3</w:t>
       </w:r>
     </w:p>
     <w:p>
@@ -137,7 +137,7 @@
       </w:pPr>
       <w:r>
         <w:rPr/>
-        <w:t xml:space="preserve">21</w:t>
+        <w:t xml:space="preserve">22</w:t>
       </w:r>
     </w:p>
     <w:p>
@@ -155,7 +155,7 @@
       </w:pPr>
       <w:r>
         <w:rPr/>
-        <w:t xml:space="preserve">11</w:t>
+        <w:t xml:space="preserve">12</w:t>
       </w:r>
     </w:p>
     <w:p>
@@ -173,7 +173,7 @@
       </w:pPr>
       <w:r>
         <w:rPr/>
-        <w:t xml:space="preserve">32</w:t>
+        <w:t xml:space="preserve">34</w:t>
       </w:r>
     </w:p>
     <w:p>
@@ -191,7 +191,7 @@
       </w:pPr>
       <w:r>
         <w:rPr/>
-        <w:t xml:space="preserve">Como parte de las pruebas se detectó y corrigió un problema: la subida de imágenes aceptaba archivos que no eran imágenes reales (respondía 500). Ahora la API valida la estructura real del archivo (magic bytes) y responde 400. También se ajustó la prueba del "JPEG genuino" para usar una imagen real.</w:t>
+        <w:t xml:space="preserve">Como parte de las pruebas se detectó y corrigió un problema: la subida de imágenes aceptaba archivos que no eran imágenes reales (respondía 500). Ahora la API valida la estructura real del archivo (magic bytes) y responde 400. También se ajustó la prueba del "JPEG genuino" para usar una imagen real. En la v1.3 se añadieron la moderación automática de imágenes (clasificador NSFW local) y el sistema de denuncias con gestión en el panel de admin.</w:t>
       </w:r>
     </w:p>
     <w:p>
@@ -885,45 +885,45 @@
             </w:pPr>
             <w:r>
               <w:rPr/>
-              <w:t xml:space="preserve">Brevo (correo)</w:t>
-            </w:r>
-          </w:p>
-        </w:tc>
-        <w:tc>
-          <w:tcPr>
-            <w:tcBorders>
-              <w:top w:val="single" w:sz="1" w:space="0" w:color="000000"/>
-              <w:bottom w:val="single" w:sz="1" w:space="0" w:color="000000"/>
-              <w:left w:val="single" w:sz="1" w:space="0" w:color="000000"/>
-              <w:right w:val="single" w:sz="1" w:space="0" w:color="000000"/>
-            </w:tcBorders>
-          </w:tcPr>
-          <w:p>
-            <w:pPr>
-              <w:spacing w:lineRule="auto"/>
-            </w:pPr>
-            <w:r>
-              <w:rPr/>
-              <w:t xml:space="preserve">API v3</w:t>
-            </w:r>
-          </w:p>
-        </w:tc>
-        <w:tc>
-          <w:tcPr>
-            <w:tcBorders>
-              <w:top w:val="single" w:sz="1" w:space="0" w:color="000000"/>
-              <w:bottom w:val="single" w:sz="1" w:space="0" w:color="000000"/>
-              <w:left w:val="single" w:sz="1" w:space="0" w:color="000000"/>
-              <w:right w:val="single" w:sz="1" w:space="0" w:color="000000"/>
-            </w:tcBorders>
-          </w:tcPr>
-          <w:p>
-            <w:pPr>
-              <w:spacing w:lineRule="auto"/>
-            </w:pPr>
-            <w:r>
-              <w:rPr/>
-              <w:t xml:space="preserve">Flujo de recuperación de contraseña; el envío pasa por la cola de correos (cola_emails) con reintentos.</w:t>
+              <w:t xml:space="preserve">nsfwjs + @tensorflow/tfjs (puro JS)</w:t>
+            </w:r>
+          </w:p>
+        </w:tc>
+        <w:tc>
+          <w:tcPr>
+            <w:tcBorders>
+              <w:top w:val="single" w:sz="1" w:space="0" w:color="000000"/>
+              <w:bottom w:val="single" w:sz="1" w:space="0" w:color="000000"/>
+              <w:left w:val="single" w:sz="1" w:space="0" w:color="000000"/>
+              <w:right w:val="single" w:sz="1" w:space="0" w:color="000000"/>
+            </w:tcBorders>
+          </w:tcPr>
+          <w:p>
+            <w:pPr>
+              <w:spacing w:lineRule="auto"/>
+            </w:pPr>
+            <w:r>
+              <w:rPr/>
+              <w:t xml:space="preserve">2.x / 4.x</w:t>
+            </w:r>
+          </w:p>
+        </w:tc>
+        <w:tc>
+          <w:tcPr>
+            <w:tcBorders>
+              <w:top w:val="single" w:sz="1" w:space="0" w:color="000000"/>
+              <w:bottom w:val="single" w:sz="1" w:space="0" w:color="000000"/>
+              <w:left w:val="single" w:sz="1" w:space="0" w:color="000000"/>
+              <w:right w:val="single" w:sz="1" w:space="0" w:color="000000"/>
+            </w:tcBorders>
+          </w:tcPr>
+          <w:p>
+            <w:pPr>
+              <w:spacing w:lineRule="auto"/>
+            </w:pPr>
+            <w:r>
+              <w:rPr/>
+              <w:t xml:space="preserve">Clasificador local (MobileNetV2) que modera las imágenes subidas al muro dentro de la propia API; no envía las fotos a terceros.</w:t>
             </w:r>
           </w:p>
         </w:tc>
@@ -947,6 +947,68 @@
             </w:pPr>
             <w:r>
               <w:rPr/>
+              <w:t xml:space="preserve">Brevo (correo)</w:t>
+            </w:r>
+          </w:p>
+        </w:tc>
+        <w:tc>
+          <w:tcPr>
+            <w:tcBorders>
+              <w:top w:val="single" w:sz="1" w:space="0" w:color="000000"/>
+              <w:bottom w:val="single" w:sz="1" w:space="0" w:color="000000"/>
+              <w:left w:val="single" w:sz="1" w:space="0" w:color="000000"/>
+              <w:right w:val="single" w:sz="1" w:space="0" w:color="000000"/>
+            </w:tcBorders>
+          </w:tcPr>
+          <w:p>
+            <w:pPr>
+              <w:spacing w:lineRule="auto"/>
+            </w:pPr>
+            <w:r>
+              <w:rPr/>
+              <w:t xml:space="preserve">API v3</w:t>
+            </w:r>
+          </w:p>
+        </w:tc>
+        <w:tc>
+          <w:tcPr>
+            <w:tcBorders>
+              <w:top w:val="single" w:sz="1" w:space="0" w:color="000000"/>
+              <w:bottom w:val="single" w:sz="1" w:space="0" w:color="000000"/>
+              <w:left w:val="single" w:sz="1" w:space="0" w:color="000000"/>
+              <w:right w:val="single" w:sz="1" w:space="0" w:color="000000"/>
+            </w:tcBorders>
+          </w:tcPr>
+          <w:p>
+            <w:pPr>
+              <w:spacing w:lineRule="auto"/>
+            </w:pPr>
+            <w:r>
+              <w:rPr/>
+              <w:t xml:space="preserve">Flujo de recuperación de contraseña; el envío pasa por la cola de correos (cola_emails) con reintentos.</w:t>
+            </w:r>
+          </w:p>
+        </w:tc>
+      </w:tr>
+      <w:tr>
+        <w:trPr>
+          <w:cantSplit/>
+        </w:trPr>
+        <w:tc>
+          <w:tcPr>
+            <w:tcBorders>
+              <w:top w:val="single" w:sz="1" w:space="0" w:color="000000"/>
+              <w:bottom w:val="single" w:sz="1" w:space="0" w:color="000000"/>
+              <w:left w:val="single" w:sz="1" w:space="0" w:color="000000"/>
+              <w:right w:val="single" w:sz="1" w:space="0" w:color="000000"/>
+            </w:tcBorders>
+          </w:tcPr>
+          <w:p>
+            <w:pPr>
+              <w:spacing w:lineRule="auto"/>
+            </w:pPr>
+            <w:r>
+              <w:rPr/>
               <w:t xml:space="preserve">bcryptjs / jsonwebtoken</w:t>
             </w:r>
           </w:p>
@@ -1016,7 +1078,7 @@
       </w:pPr>
       <w:r>
         <w:rPr/>
-        <w:t xml:space="preserve">3.1 Backend (21 pruebas)</w:t>
+        <w:t xml:space="preserve">3.1 Backend (22 pruebas)</w:t>
       </w:r>
     </w:p>
     <w:p>
@@ -1036,7 +1098,7 @@
         <w:rPr>
           <w:rFonts w:ascii="Courier" w:hAnsi="Courier"/>
         </w:rPr>
-        <w:t xml:space="preserve"> npm test # cd del directorio raíz del proyecto (backend) # Resultado: 21 passed, 0 failed  (~3,5 s) </w:t>
+        <w:t xml:space="preserve"> npm test # cd del directorio raíz del proyecto (backend) # Resultado: 22 passed, 0 failed  (~5 s) </w:t>
       </w:r>
     </w:p>
     <w:p>
@@ -1046,7 +1108,7 @@
       </w:pPr>
       <w:r>
         <w:rPr/>
-        <w:t xml:space="preserve">3.2 Frontend e2e (11 pruebas)</w:t>
+        <w:t xml:space="preserve">3.2 Frontend e2e (12 pruebas)</w:t>
       </w:r>
     </w:p>
     <w:p>
@@ -1066,7 +1128,7 @@
         <w:rPr>
           <w:rFonts w:ascii="Courier" w:hAnsi="Courier"/>
         </w:rPr>
-        <w:t xml:space="preserve"> cd frontend npx playwright install chromium   # solo la primera vez npm run test:e2e                  # o: npx playwright test # Resultado: 11 passed, 0 failed   (~10-25 s) </w:t>
+        <w:t xml:space="preserve"> cd frontend npx playwright install chromium   # solo la primera vez npm run test:e2e                  # o: npx playwright test # Resultado: 12 passed, 0 failed   (~10-30 s) </w:t>
       </w:r>
     </w:p>
     <w:p>
@@ -2904,6 +2966,87 @@
           </w:p>
         </w:tc>
       </w:tr>
+      <w:tr>
+        <w:trPr>
+          <w:cantSplit/>
+        </w:trPr>
+        <w:tc>
+          <w:tcPr>
+            <w:tcBorders>
+              <w:top w:val="single" w:sz="1" w:space="0" w:color="000000"/>
+              <w:bottom w:val="single" w:sz="1" w:space="0" w:color="000000"/>
+              <w:left w:val="single" w:sz="1" w:space="0" w:color="000000"/>
+              <w:right w:val="single" w:sz="1" w:space="0" w:color="000000"/>
+            </w:tcBorders>
+          </w:tcPr>
+          <w:p>
+            <w:pPr>
+              <w:spacing w:lineRule="auto"/>
+            </w:pPr>
+            <w:r>
+              <w:rPr/>
+              <w:t xml:space="preserve">22</w:t>
+            </w:r>
+          </w:p>
+        </w:tc>
+        <w:tc>
+          <w:tcPr>
+            <w:tcBorders>
+              <w:top w:val="single" w:sz="1" w:space="0" w:color="000000"/>
+              <w:bottom w:val="single" w:sz="1" w:space="0" w:color="000000"/>
+              <w:left w:val="single" w:sz="1" w:space="0" w:color="000000"/>
+              <w:right w:val="single" w:sz="1" w:space="0" w:color="000000"/>
+            </w:tcBorders>
+          </w:tcPr>
+          <w:p>
+            <w:pPr>
+              <w:spacing w:lineRule="auto"/>
+            </w:pPr>
+            <w:r>
+              <w:rPr/>
+              <w:t xml:space="preserve">Flujo completo de denuncia: crear, listar como admin y resolver</w:t>
+            </w:r>
+          </w:p>
+        </w:tc>
+        <w:tc>
+          <w:tcPr>
+            <w:tcBorders>
+              <w:top w:val="single" w:sz="1" w:space="0" w:color="000000"/>
+              <w:bottom w:val="single" w:sz="1" w:space="0" w:color="000000"/>
+              <w:left w:val="single" w:sz="1" w:space="0" w:color="000000"/>
+              <w:right w:val="single" w:sz="1" w:space="0" w:color="000000"/>
+            </w:tcBorders>
+          </w:tcPr>
+          <w:p>
+            <w:pPr>
+              <w:spacing w:lineRule="auto"/>
+            </w:pPr>
+            <w:r>
+              <w:rPr/>
+              <w:t xml:space="preserve">Un usuario denuncia una publicación ajena (201); otra denuncia del mismo usuario actualiza el motivo (no duplica); solo el admin las lista (403 al denunciante); se resuelve (descartada) y se rechaza un estado inválido (400).</w:t>
+            </w:r>
+          </w:p>
+        </w:tc>
+        <w:tc>
+          <w:tcPr>
+            <w:tcBorders>
+              <w:top w:val="single" w:sz="1" w:space="0" w:color="000000"/>
+              <w:bottom w:val="single" w:sz="1" w:space="0" w:color="000000"/>
+              <w:left w:val="single" w:sz="1" w:space="0" w:color="000000"/>
+              <w:right w:val="single" w:sz="1" w:space="0" w:color="000000"/>
+            </w:tcBorders>
+          </w:tcPr>
+          <w:p>
+            <w:pPr>
+              <w:spacing w:lineRule="auto"/>
+            </w:pPr>
+            <w:r>
+              <w:rPr/>
+              <w:t xml:space="preserve">Aprobada</w:t>
+            </w:r>
+          </w:p>
+        </w:tc>
+      </w:tr>
     </w:tbl>
     <w:p>
       <w:pPr>
@@ -3942,6 +4085,87 @@
           </w:p>
         </w:tc>
       </w:tr>
+      <w:tr>
+        <w:trPr>
+          <w:cantSplit/>
+        </w:trPr>
+        <w:tc>
+          <w:tcPr>
+            <w:tcBorders>
+              <w:top w:val="single" w:sz="1" w:space="0" w:color="000000"/>
+              <w:bottom w:val="single" w:sz="1" w:space="0" w:color="000000"/>
+              <w:left w:val="single" w:sz="1" w:space="0" w:color="000000"/>
+              <w:right w:val="single" w:sz="1" w:space="0" w:color="000000"/>
+            </w:tcBorders>
+          </w:tcPr>
+          <w:p>
+            <w:pPr>
+              <w:spacing w:lineRule="auto"/>
+            </w:pPr>
+            <w:r>
+              <w:rPr/>
+              <w:t xml:space="preserve">12</w:t>
+            </w:r>
+          </w:p>
+        </w:tc>
+        <w:tc>
+          <w:tcPr>
+            <w:tcBorders>
+              <w:top w:val="single" w:sz="1" w:space="0" w:color="000000"/>
+              <w:bottom w:val="single" w:sz="1" w:space="0" w:color="000000"/>
+              <w:left w:val="single" w:sz="1" w:space="0" w:color="000000"/>
+              <w:right w:val="single" w:sz="1" w:space="0" w:color="000000"/>
+            </w:tcBorders>
+          </w:tcPr>
+          <w:p>
+            <w:pPr>
+              <w:spacing w:lineRule="auto"/>
+            </w:pPr>
+            <w:r>
+              <w:rPr/>
+              <w:t xml:space="preserve">Denunciar una publicación desde el muro</w:t>
+            </w:r>
+          </w:p>
+        </w:tc>
+        <w:tc>
+          <w:tcPr>
+            <w:tcBorders>
+              <w:top w:val="single" w:sz="1" w:space="0" w:color="000000"/>
+              <w:bottom w:val="single" w:sz="1" w:space="0" w:color="000000"/>
+              <w:left w:val="single" w:sz="1" w:space="0" w:color="000000"/>
+              <w:right w:val="single" w:sz="1" w:space="0" w:color="000000"/>
+            </w:tcBorders>
+          </w:tcPr>
+          <w:p>
+            <w:pPr>
+              <w:spacing w:lineRule="auto"/>
+            </w:pPr>
+            <w:r>
+              <w:rPr/>
+              <w:t xml:space="preserve">Un usuario (sin ser el autor) abre el formulario de denuncia desde el botón del muro, elige el motivo «Violencia», escribe un detalle y recibe la confirmación «Gracias por tu denuncia».</w:t>
+            </w:r>
+          </w:p>
+        </w:tc>
+        <w:tc>
+          <w:tcPr>
+            <w:tcBorders>
+              <w:top w:val="single" w:sz="1" w:space="0" w:color="000000"/>
+              <w:bottom w:val="single" w:sz="1" w:space="0" w:color="000000"/>
+              <w:left w:val="single" w:sz="1" w:space="0" w:color="000000"/>
+              <w:right w:val="single" w:sz="1" w:space="0" w:color="000000"/>
+            </w:tcBorders>
+          </w:tcPr>
+          <w:p>
+            <w:pPr>
+              <w:spacing w:lineRule="auto"/>
+            </w:pPr>
+            <w:r>
+              <w:rPr/>
+              <w:t xml:space="preserve">Aprobada</w:t>
+            </w:r>
+          </w:p>
+        </w:tc>
+      </w:tr>
     </w:tbl>
     <w:p>
       <w:pPr>
@@ -3959,19 +4183,11 @@
         <w:rPr>
           <w:b/>
         </w:rPr>
-        <w:t xml:space="preserve">Nuevo en esta versión:</w:t>
-      </w:r>
-      <w:r>
-        <w:rPr/>
-        <w:t xml:space="preserve"> se añadieron 2 casos e2e de seguridad XSS. Un usuario publica en el muro y comenta un local con payloads clásicos (&lt;script&gt;, &lt;img onerror&gt;, &lt;svg onload&gt;); la interfaz los muestra como texto plano inerte: no se crea ningún elemento vivo (0 scripts/etiquetas ejecutables) y las variables </w:t>
-      </w:r>
-      <w:r>
-        <w:rPr/>
-        <w:t xml:space="preserve">window</w:t>
-      </w:r>
-      <w:r>
-        <w:rPr/>
-        <w:t xml:space="preserve"> que el payload intenta fijar permanecen indefinidas.</w:t>
+        <w:t xml:space="preserve">Nuevo en esta versión (v1.3):</w:t>
+      </w:r>
+      <w:r>
+        <w:rPr/>
+        <w:t xml:space="preserve"> se añadió un caso e2e de denuncias y la moderación automática de imágenes. Toda imagen que se sube a una publicación pasa primero por un clasificador NSFW local (modelo MobileNetV2 de NSFWJS, ejecutado en el servidor sin enviar datos a terceros); si detecta contenido sexual, la subida se rechaza con un mensaje claro. Para el contenido que el clasificador no cubre (por ejemplo violencia), cualquier usuario puede denunciar la publicación y el admin la revisa en la pestaña «Reportes» (aprobarla, descartarla o eliminar la publicación).</w:t>
       </w:r>
     </w:p>
     <w:p>
@@ -4100,6 +4316,25 @@
     </w:p>
     <w:p>
       <w:pPr>
+        <w:numPr>
+          <w:ilvl w:val="0"/>
+          <w:numId w:val="1"/>
+        </w:numPr>
+        <w:spacing w:lineRule="auto"/>
+      </w:pPr>
+      <w:r>
+        <w:rPr>
+          <w:b/>
+        </w:rPr>
+        <w:t xml:space="preserve">Pruebas de moderación de la comunidad:</w:t>
+      </w:r>
+      <w:r>
+        <w:rPr/>
+        <w:t xml:space="preserve"> moderación automática (clasificador NSFW local en la subida de imágenes) y flujo de denuncias con gestión por el administrador (listado, resolución, eliminación de la publicación).</w:t>
+      </w:r>
+    </w:p>
+    <w:p>
+      <w:pPr>
         <w:pStyle w:val="Heading1"/>
         <w:spacing w:lineRule="auto"/>
       </w:pPr>
@@ -4114,7 +4349,7 @@
       </w:pPr>
       <w:r>
         <w:rPr/>
-        <w:t xml:space="preserve">21/21</w:t>
+        <w:t xml:space="preserve">22/22</w:t>
       </w:r>
     </w:p>
     <w:p>
@@ -4132,7 +4367,7 @@
       </w:pPr>
       <w:r>
         <w:rPr/>
-        <w:t xml:space="preserve">11/11</w:t>
+        <w:t xml:space="preserve">12/12</w:t>
       </w:r>
     </w:p>
     <w:p>
@@ -4168,7 +4403,7 @@
       </w:pPr>
       <w:r>
         <w:rPr/>
-        <w:t xml:space="preserve">Todas las pruebas fueron ejecutadas el 30 de agosto de 2026 y quedaron versionadas en el repositorio (rama </w:t>
+        <w:t xml:space="preserve">Todas las pruebas fueron ejecutadas el 4 de septiembre de 2026 y quedaron versionadas en el repositorio (rama </w:t>
       </w:r>
       <w:r>
         <w:rPr/>

</xml_diff>